<commit_message>
Update BPMN workflow COD fee
</commit_message>
<xml_diff>
--- a/01.WORKING_SPACE/hai/TRANVIETHAI_25410198.docx
+++ b/01.WORKING_SPACE/hai/TRANVIETHAI_25410198.docx
@@ -9337,6 +9337,54 @@
       </w:r>
     </w:p>
     <w:p>
+      <w:r>
+        <w:rPr>
+          <w:noProof/>
+        </w:rPr>
+        <w:drawing>
+          <wp:inline distT="0" distB="0" distL="0" distR="0" wp14:anchorId="701064CE" wp14:editId="15D86FA9">
+            <wp:extent cx="5731510" cy="2845435"/>
+            <wp:effectExtent l="0" t="0" r="2540" b="0"/>
+            <wp:docPr id="1960889104" name="Picture 12"/>
+            <wp:cNvGraphicFramePr>
+              <a:graphicFrameLocks xmlns:a="http://schemas.openxmlformats.org/drawingml/2006/main" noChangeAspect="1"/>
+            </wp:cNvGraphicFramePr>
+            <a:graphic xmlns:a="http://schemas.openxmlformats.org/drawingml/2006/main">
+              <a:graphicData uri="http://schemas.openxmlformats.org/drawingml/2006/picture">
+                <pic:pic xmlns:pic="http://schemas.openxmlformats.org/drawingml/2006/picture">
+                  <pic:nvPicPr>
+                    <pic:cNvPr id="1960889104" name="Picture 1960889104"/>
+                    <pic:cNvPicPr/>
+                  </pic:nvPicPr>
+                  <pic:blipFill>
+                    <a:blip r:embed="rId18" cstate="print">
+                      <a:extLst>
+                        <a:ext uri="{28A0092B-C50C-407E-A947-70E740481C1C}">
+                          <a14:useLocalDpi xmlns:a14="http://schemas.microsoft.com/office/drawing/2010/main" val="0"/>
+                        </a:ext>
+                      </a:extLst>
+                    </a:blip>
+                    <a:stretch>
+                      <a:fillRect/>
+                    </a:stretch>
+                  </pic:blipFill>
+                  <pic:spPr>
+                    <a:xfrm>
+                      <a:off x="0" y="0"/>
+                      <a:ext cx="5731510" cy="2845435"/>
+                    </a:xfrm>
+                    <a:prstGeom prst="rect">
+                      <a:avLst/>
+                    </a:prstGeom>
+                  </pic:spPr>
+                </pic:pic>
+              </a:graphicData>
+            </a:graphic>
+          </wp:inline>
+        </w:drawing>
+      </w:r>
+    </w:p>
+    <w:p>
       <w:pPr>
         <w:rPr>
           <w:lang w:val="en-US"/>
@@ -9422,6 +9470,7 @@
         <w:pStyle w:val="Heading3"/>
       </w:pPr>
       <w:r>
+        <w:lastRenderedPageBreak/>
         <w:t>4.2</w:t>
       </w:r>
       <w:r>
@@ -9668,7 +9717,6 @@
         <w:rPr>
           <w:lang w:val="en-US"/>
         </w:rPr>
-        <w:lastRenderedPageBreak/>
         <w:t xml:space="preserve">Kiểm tra hàng theo chính sách cho phép. </w:t>
       </w:r>
     </w:p>
@@ -9914,6 +9962,12 @@
         </w:rPr>
         <w:t xml:space="preserve">Thu tiền COD. </w:t>
       </w:r>
+      <w:r>
+        <w:rPr>
+          <w:lang w:val="en-US"/>
+        </w:rPr>
+        <w:t>Kho</w:t>
+      </w:r>
     </w:p>
     <w:p>
       <w:pPr>
@@ -10019,6 +10073,7 @@
           <w:ilvl w:val="0"/>
           <w:numId w:val="9"/>
         </w:numPr>
+        <w:ind w:left="1440" w:hanging="1080"/>
         <w:rPr>
           <w:lang w:val="en-US"/>
         </w:rPr>
@@ -10159,6 +10214,7 @@
         <w:rPr>
           <w:lang w:val="en-US"/>
         </w:rPr>
+        <w:lastRenderedPageBreak/>
         <w:t xml:space="preserve">Quản lý các đơn đã giao thành công. </w:t>
       </w:r>
     </w:p>
@@ -10457,7 +10513,6 @@
           <w:bCs/>
           <w:lang w:val="en-US"/>
         </w:rPr>
-        <w:lastRenderedPageBreak/>
         <w:t>9. Bộ phận chăm sóc khách hàng</w:t>
       </w:r>
     </w:p>
@@ -10859,6 +10914,7 @@
           <w:bCs/>
           <w:lang w:val="en-US"/>
         </w:rPr>
+        <w:lastRenderedPageBreak/>
         <w:t>Giao hàng → Thu tiền → Đối soát → Chuyển tiền.</w:t>
       </w:r>
     </w:p>
@@ -11090,7 +11146,6 @@
         <w:rPr>
           <w:lang w:val="en-US"/>
         </w:rPr>
-        <w:lastRenderedPageBreak/>
         <w:t xml:space="preserve">COD Settlement giúp Viettel Post không chỉ là đơn vị vận chuyển mà còn cung cấp một phần dịch vụ hỗ trợ </w:t>
       </w:r>
       <w:r>
@@ -11440,6 +11495,7 @@
           <w:bCs/>
           <w:lang w:val="en-US"/>
         </w:rPr>
+        <w:lastRenderedPageBreak/>
         <w:t>4. Kết quả dữ liệu</w:t>
       </w:r>
     </w:p>
@@ -11580,7 +11636,6 @@
         <w:pStyle w:val="Heading3"/>
       </w:pPr>
       <w:r>
-        <w:lastRenderedPageBreak/>
         <w:t>4.3</w:t>
       </w:r>
       <w:r>
@@ -15658,6 +15713,7 @@
   <w:style w:type="character" w:default="1" w:styleId="DefaultParagraphFont">
     <w:name w:val="Default Paragraph Font"/>
     <w:uiPriority w:val="1"/>
+    <w:semiHidden/>
     <w:unhideWhenUsed/>
   </w:style>
   <w:style w:type="table" w:default="1" w:styleId="TableNormal">
@@ -16167,28 +16223,28 @@
 </file>
 
 <file path=customXml/item1.xml><?xml version="1.0" encoding="utf-8"?>
+<b:Sources xmlns:b="http://schemas.openxmlformats.org/officeDocument/2006/bibliography" xmlns="http://schemas.openxmlformats.org/officeDocument/2006/bibliography" SelectedStyle="\APASixthEditionOfficeOnline.xsl" StyleName="APA" Version="6"/>
+</file>
+
+<file path=customXml/item2.xml><?xml version="1.0" encoding="utf-8"?>
 <go:gDocsCustomXmlDataStorage xmlns:go="http://customooxmlschemas.google.com/" xmlns:r="http://schemas.openxmlformats.org/officeDocument/2006/relationships" uri="GoogleDocsCustomDataVersion2">
   <go:docsCustomData xmlns:go="http://customooxmlschemas.google.com/" roundtripDataSignature="AMtx7miqxAGz23usey6O/EonoHgXxgGtuA==">CgMxLjAaHwoBMBIaChgICVIUChJ0YWJsZS5kdWVyc2lvb2l5cjUyDmguYXByMzk1aHRxZnZmMg5oLmJzOGl3aHZxNzdzNzIOaC5uMWU0ZXpiNGxieG8yDmgueDFncnhqM29mMDJjMg5oLmlpOHBoOHF3Mzl1djIOaC5yaTc0c3V1dWh3eGUyDmguaDk4dHBlMXg2NmliMg5oLjR3bzhoY2NmcmdwbzIOaC45ZnNhdDRzbDFzeHMyDWguZndjaDN1Y2hlcjMyDWguZmNzODVrcDVwdnUyDWguajh5bG11N2JhNTgyDmgucmhtcm44MWt2NXV0Mg5oLmM3OTZrbDFoZmV6MDIOaC5xcGJrOHBkYm8weWI4AHIhMW5Wc0ZhUzdsYW9Ld3FUazdLRkFzblgyUUtCclp1bWVD</go:docsCustomData>
 </go:gDocsCustomXmlDataStorage>
 </file>
 
-<file path=customXml/item2.xml><?xml version="1.0" encoding="utf-8"?>
-<b:Sources xmlns:b="http://schemas.openxmlformats.org/officeDocument/2006/bibliography" xmlns="http://schemas.openxmlformats.org/officeDocument/2006/bibliography" SelectedStyle="\APASixthEditionOfficeOnline.xsl" StyleName="APA" Version="6"/>
+<file path=customXml/itemProps1.xml><?xml version="1.0" encoding="utf-8"?>
+<ds:datastoreItem xmlns:ds="http://schemas.openxmlformats.org/officeDocument/2006/customXml" ds:itemID="{320912D7-B4CD-49BF-B176-43820B1172FC}">
+  <ds:schemaRefs>
+    <ds:schemaRef ds:uri="http://schemas.openxmlformats.org/officeDocument/2006/bibliography"/>
+  </ds:schemaRefs>
+</ds:datastoreItem>
 </file>
 
-<file path=customXml/itemProps1.xml><?xml version="1.0" encoding="utf-8"?>
+<file path=customXml/itemProps2.xml><?xml version="1.0" encoding="utf-8"?>
 <ds:datastoreItem xmlns:ds="http://schemas.openxmlformats.org/officeDocument/2006/customXml" ds:itemID="{11111111-1234-1234-1234-123412341234}">
   <ds:schemaRefs>
     <ds:schemaRef ds:uri="http://customooxmlschemas.google.com/"/>
     <ds:schemaRef ds:uri="http://schemas.openxmlformats.org/officeDocument/2006/relationships"/>
   </ds:schemaRefs>
 </ds:datastoreItem>
-</file>
-
-<file path=customXml/itemProps2.xml><?xml version="1.0" encoding="utf-8"?>
-<ds:datastoreItem xmlns:ds="http://schemas.openxmlformats.org/officeDocument/2006/customXml" ds:itemID="{320912D7-B4CD-49BF-B176-43820B1172FC}">
-  <ds:schemaRefs>
-    <ds:schemaRef ds:uri="http://schemas.openxmlformats.org/officeDocument/2006/bibliography"/>
-  </ds:schemaRefs>
-</ds:datastoreItem>
 </file>
</xml_diff>